<commit_message>
dev: skill back-office, golden set, latihan, runtime prototipe
Co-Authored-By: Claude Opus 5.5 <noreply@anthropic.com>
</commit_message>
<xml_diff>
--- a/contoh/hasil/laporan_insiden.docx
+++ b/contoh/hasil/laporan_insiden.docx
@@ -153,7 +153,7 @@
           <w:color w:val="6B7280"/>
           <w:sz w:val="20"/>
         </w:rPr>
-        <w:t xml:space="preserve">Nomor: INS/TI/2026/10/0004</w:t>
+        <w:t xml:space="preserve">Nomor: INS/TI/2026/10/0001</w:t>
       </w:r>
     </w:p>
     <w:tbl>
@@ -1704,6 +1704,84 @@
     </w:tbl>
     <w:p>
       <w:pPr>
+        <w:spacing w:before="0" w:after="0" w:line="120" w:lineRule="auto"/>
+      </w:pPr>
+    </w:p>
+    <w:tbl>
+      <w:tblPr>
+        <w:tblW w:type="auto" w:w="0"/>
+        <w:tblLayout w:type="fixed"/>
+        <w:tblLook w:firstColumn="1" w:firstRow="1" w:lastColumn="0" w:lastRow="0" w:noHBand="0" w:noVBand="1" w:val="04A0"/>
+        <w:tblBorders>
+          <w:top w:val="single" w:sz="8" w:space="0" w:color="B46A0C"/>
+          <w:left w:val="single" w:sz="8" w:space="0" w:color="B46A0C"/>
+          <w:bottom w:val="single" w:sz="8" w:space="0" w:color="B46A0C"/>
+          <w:right w:val="single" w:sz="8" w:space="0" w:color="B46A0C"/>
+          <w:insideH w:val="nil"/>
+          <w:insideV w:val="nil"/>
+        </w:tblBorders>
+      </w:tblPr>
+      <w:tblGrid>
+        <w:gridCol w:w="9525"/>
+      </w:tblGrid>
+      <w:tr>
+        <w:tc>
+          <w:tcPr>
+            <w:tcW w:type="dxa" w:w="9524"/>
+            <w:shd w:val="clear" w:color="auto" w:fill="FEF3C7"/>
+            <w:vAlign w:val="center"/>
+            <w:tcMar>
+              <w:top w:w="60" w:type="dxa"/>
+              <w:bottom w:w="60" w:type="dxa"/>
+              <w:start w:w="90" w:type="dxa"/>
+              <w:end w:w="90" w:type="dxa"/>
+            </w:tcMar>
+          </w:tcPr>
+          <w:p>
+            <w:pPr>
+              <w:spacing w:after="0" w:before="0"/>
+            </w:pPr>
+            <w:r/>
+            <w:r>
+              <w:rPr>
+                <w:rFonts w:ascii="Calibri" w:hAnsi="Calibri"/>
+                <w:b/>
+                <w:i w:val="0"/>
+                <w:color w:val="B46A0C"/>
+                <w:sz w:val="19"/>
+              </w:rPr>
+              <w:t>Perhatian</w:t>
+            </w:r>
+          </w:p>
+          <w:p>
+            <w:pPr>
+              <w:spacing w:after="40"/>
+            </w:pPr>
+            <w:r>
+              <w:rPr>
+                <w:rFonts w:ascii="Calibri" w:hAnsi="Calibri"/>
+                <w:b/>
+                <w:i w:val="0"/>
+                <w:color w:val="B46A0C"/>
+                <w:sz w:val="19"/>
+              </w:rPr>
+              <w:t xml:space="preserve">•  </w:t>
+            </w:r>
+            <w:r>
+              <w:rPr>
+                <w:rFonts w:ascii="Calibri" w:hAnsi="Calibri"/>
+                <w:b w:val="0"/>
+                <w:i w:val="0"/>
+                <w:sz w:val="19"/>
+              </w:rPr>
+              <w:t xml:space="preserve">Insiden P2 wajib postmortem tertulis paling lambat 5 hari kerja setelah pulih (Pasal 6 ayat 3).</w:t>
+            </w:r>
+          </w:p>
+        </w:tc>
+      </w:tr>
+    </w:tbl>
+    <w:p>
+      <w:pPr>
         <w:keepNext/>
         <w:spacing w:before="0" w:after="80" w:line="264" w:lineRule="auto"/>
       </w:pPr>

</xml_diff>